<commit_message>
KAN-175: finalize verified manuscript package
</commit_message>
<xml_diff>
--- a/manuscript/submission/Manuscript_JADR_FINAL.docx
+++ b/manuscript/submission/Manuscript_JADR_FINAL.docx
@@ -115,15 +115,15 @@
         <w:pStyle w:val="Normal"/>
       </w:pPr>
       <w:r>
-        <w:t xml:space="preserve">Depressive symptoms co-occur with differences in sleep and daily activity patterns. Wrist-worn activity monitoring offers a way to describe movement in everyday settings, but actigraphy records movement-derived states rather than physiological sleep stages. A participant's nocturnal movement may be summarized by duration, timing, or the sequence of changes between relatively lower- and higher-activity periods.</w:t>
-      </w:r>
-    </w:p>
-    <w:p>
-      <w:pPr>
-        <w:pStyle w:val="Normal"/>
-      </w:pPr>
-      <w:r>
-        <w:t xml:space="preserve">We examined a compact transition measure, nocturnal rest-to-activity transition probability (P01), in the publicly available NHANES 2013–2014 sample. The question was whether this complementary behavioral measure was cross-sectionally associated with continuous PHQ-9 symptom burden after demographic and sleep-related adjustment. We also estimated its incremental out-of-fold discrimination for PHQ-9 scores of 10 or higher as an exploratory secondary analysis. These analyses do not establish temporal direction, causality, diagnostic performance, or suitability for clinical decision-making.</w:t>
+        <w:t xml:space="preserve">Depressive symptoms co-occur with differences in sleep and circadian rest-activity patterns [6]. Wrist-worn activity monitoring offers a way to describe movement in everyday settings, but actigraphy records movement-derived states rather than physiological sleep stages. A participant's nocturnal movement may be summarized by duration, timing, or the sequence of changes between relatively lower- and higher-activity periods.</w:t>
+      </w:r>
+    </w:p>
+    <w:p>
+      <w:pPr>
+        <w:pStyle w:val="Normal"/>
+      </w:pPr>
+      <w:r>
+        <w:t xml:space="preserve">Digital-phenotyping research has also highlighted the limitations of relying only on time-averaged features and the potential value of methods that retain temporal dynamics [7]. We examined a compact transition measure, nocturnal rest-to-activity transition probability (P01), in the publicly available NHANES 2013–2014 sample. The question was whether this complementary behavioral measure was cross-sectionally associated with continuous PHQ-9 symptom burden after demographic and sleep-related adjustment. We also estimated its incremental out-of-fold discrimination for PHQ-9 scores of 10 or higher as an exploratory secondary analysis. These analyses do not establish temporal direction, causality, diagnostic performance, or suitability for clinical decision-making.</w:t>
       </w:r>
     </w:p>
     <w:p>
@@ -147,7 +147,7 @@
         <w:pStyle w:val="Normal"/>
       </w:pPr>
       <w:r>
-        <w:t xml:space="preserve">This cross-sectional secondary analysis combined NHANES 2013–2014 physical activity monitor (PAM) minute data and demographic, examination, sleep-questionnaire, and depression-questionnaire data. PAM minute activity is reported as Monitor-Independent Movement Summary (MIMS; PAXMTSM). NHANES data are publicly available and de-identified. The parent NHANES protocol was reviewed by the National Center for Health Statistics Research Ethics Review Board, and participants provided informed consent [2,3].</w:t>
+        <w:t xml:space="preserve">This cross-sectional secondary analysis combined NHANES 2013–2014 physical activity monitor (PAM) minute data and demographic, examination, sleep-questionnaire, and depression-questionnaire data. PAM minute activity is reported as Monitor-Independent Movement Summary (MIMS; PAXMTSM), an open-source device-independent acceleration summary metric [8]. NHANES data are publicly available and de-identified. The parent NHANES protocol was reviewed by the National Center for Health Statistics Research Ethics Review Board, and participants provided informed consent [2,3].</w:t>
       </w:r>
     </w:p>
     <w:p>
@@ -1143,7 +1143,7 @@
         <w:pStyle w:val="Normal"/>
       </w:pPr>
       <w:r>
-        <w:t xml:space="preserve">The survey-weighted sensitivity estimate supports the direction of the primary association after incorporating the supplied examination weight, strata, and primary sampling units. It is a sensitivity analysis, not proof that all analytic selection or nonresponse issues are resolved. The cross-validated ROC comparison indicates a statistically detectable but modest incremental discrimination: the combined model AUC was 0.632 versus 0.613 for demographics. This exploratory contrast does not support individual-level screening or diagnostic application, and no external validation was performed.</w:t>
+        <w:t xml:space="preserve">A recent survey-weighted NHANES 2011–2014 analysis also reported an association between accelerometer-derived sleep irregularity and depression, although that work addressed between-day regularity rather than within-night state switching [9]. The survey-weighted sensitivity estimate in the present study supports the direction of the primary association after incorporating the supplied examination weight, strata, and primary sampling units. It is a sensitivity analysis, not proof that all analytic selection or nonresponse issues are resolved. The cross-validated ROC comparison indicates a statistically detectable but modest incremental discrimination: the combined model AUC was 0.632 versus 0.613 for demographics. This exploratory contrast does not support individual-level screening or diagnostic application, and no external validation was performed.</w:t>
       </w:r>
     </w:p>
     <w:p>
@@ -1289,7 +1289,7 @@
         <w:pStyle w:val="Normal"/>
       </w:pPr>
       <w:r>
-        <w:t xml:space="preserve">Kroenke K, Spitzer RL, Williams JBW. The PHQ-9: validity of a brief depression severity measure. </w:t>
+        <w:t xml:space="preserve">Kroenke K, Spitzer RL, Williams JB. The PHQ-9: validity of a brief depression severity measure. </w:t>
       </w:r>
       <w:r>
         <w:rPr>
@@ -1306,31 +1306,108 @@
         <w:pStyle w:val="Normal"/>
       </w:pPr>
       <w:r>
-        <w:t xml:space="preserve">Centers for Disease Control and Prevention, National Center for Health Statistics. NHANES 2013–2014: Physical Activity Monitor (PAX) Data Documentation, Codebook, and Frequencies. https://wwwn.cdc.gov/Nchs/Nhanes/2013-2014/PAX_H.htm (accessed 16 October 2026).</w:t>
-      </w:r>
-    </w:p>
-    <w:p>
-      <w:pPr>
-        <w:pStyle w:val="Normal"/>
-      </w:pPr>
-      <w:r>
-        <w:t xml:space="preserve">Centers for Disease Control and Prevention, National Center for Health Statistics. NHANES 2013–2014: Physical Activity Monitor (PAX) Examination Data and Analytic Guidance. https://wwwn.cdc.gov/nchs/nhanes/continuousnhanes/default.aspx?BeginYear=2013 (accessed 16 October 2026).</w:t>
-      </w:r>
-    </w:p>
-    <w:p>
-      <w:pPr>
-        <w:pStyle w:val="Normal"/>
-      </w:pPr>
-      <w:r>
-        <w:t xml:space="preserve">Centers for Disease Control and Prevention, National Center for Health Statistics. NHANES 2013–2014: Depression Screener (DPQ) Data Documentation, Codebook, and Frequencies. https://wwwn.cdc.gov/Nchs/Nhanes/2013-2014/DPQ_H.htm (accessed 16 October 2026).</w:t>
-      </w:r>
-    </w:p>
-    <w:p>
-      <w:pPr>
-        <w:pStyle w:val="Normal"/>
-      </w:pPr>
-      <w:r>
-        <w:t xml:space="preserve">Centers for Disease Control and Prevention, National Center for Health Statistics. NHANES 2013–2014: Sleep Disorders (SLQ) Data Documentation, Codebook, and Frequencies. https://wwwn.cdc.gov/Nchs/Nhanes/2013-2014/SLQ_H.htm (accessed 16 October 2026).</w:t>
+        <w:t xml:space="preserve">Centers for Disease Control and Prevention, National Center for Health Statistics. NHANES 2013–2014: Physical Activity Monitor - Minute (PAXMIN_H), Data Documentation, Codebook, and Frequencies. https://wwwn.cdc.gov/Nchs/Data/Nhanes/Public/2013/DataFiles/PAXMIN_H.htm (accessed 16 October 2026).</w:t>
+      </w:r>
+    </w:p>
+    <w:p>
+      <w:pPr>
+        <w:pStyle w:val="Normal"/>
+      </w:pPr>
+      <w:r>
+        <w:t xml:space="preserve">Centers for Disease Control and Prevention, National Center for Health Statistics. </w:t>
+      </w:r>
+      <w:r>
+        <w:rPr>
+          <w:i/>
+        </w:rPr>
+        <w:t xml:space="preserve">NHANES Analytic Guidelines, 2011–2014 and 2015–2016</w:t>
+      </w:r>
+      <w:r>
+        <w:t xml:space="preserve">. https://wwwn.cdc.gov/nchs/data/nhanes/analyticguidelines/11-16-analytic-guidelines.pdf (accessed 16 October 2026).</w:t>
+      </w:r>
+    </w:p>
+    <w:p>
+      <w:pPr>
+        <w:pStyle w:val="Normal"/>
+      </w:pPr>
+      <w:r>
+        <w:t xml:space="preserve">Centers for Disease Control and Prevention, National Center for Health Statistics. NHANES 2013–2014: Mental Health - Depression Screener (DPQ_H), Data Documentation, Codebook, and Frequencies. https://wwwn.cdc.gov/Nchs/Data/Nhanes/Public/2013/DataFiles/DPQ_H.htm (accessed 16 October 2026).</w:t>
+      </w:r>
+    </w:p>
+    <w:p>
+      <w:pPr>
+        <w:pStyle w:val="Normal"/>
+      </w:pPr>
+      <w:r>
+        <w:t xml:space="preserve">Centers for Disease Control and Prevention, National Center for Health Statistics. NHANES 2013–2014: Sleep Disorders (SLQ_H), Data Documentation, Codebook, and Frequencies. https://wwwn.cdc.gov/Nchs/Data/Nhanes/Public/2013/DataFiles/SLQ_H.htm (accessed 16 October 2026).</w:t>
+      </w:r>
+    </w:p>
+    <w:p>
+      <w:pPr>
+        <w:pStyle w:val="Normal"/>
+      </w:pPr>
+      <w:r>
+        <w:t xml:space="preserve">Hori H, Koga N, Hidese S, Nagashima A, Kim Y, Higuchi T, Kunugi H. 24-h activity rhythm and sleep in depressed outpatients. </w:t>
+      </w:r>
+      <w:r>
+        <w:rPr>
+          <w:i/>
+        </w:rPr>
+        <w:t xml:space="preserve">Journal of Psychiatric Research</w:t>
+      </w:r>
+      <w:r>
+        <w:t xml:space="preserve">. 2016;77:27–34. doi:10.1016/j.jpsychires.2016.02.022.</w:t>
+      </w:r>
+    </w:p>
+    <w:p>
+      <w:pPr>
+        <w:pStyle w:val="Normal"/>
+      </w:pPr>
+      <w:r>
+        <w:t xml:space="preserve">Leaning IE, Ikani N, Savage HS, Leow A, Beckmann C, Ruhé HG, Marquand AF. From smartphone data to clinically relevant predictions: a systematic review of digital phenotyping methods in depression. </w:t>
+      </w:r>
+      <w:r>
+        <w:rPr>
+          <w:i/>
+        </w:rPr>
+        <w:t xml:space="preserve">Neuroscience &amp; Biobehavioral Reviews</w:t>
+      </w:r>
+      <w:r>
+        <w:t xml:space="preserve">. 2024;158:105541. doi:10.1016/j.neubiorev.2024.105541.</w:t>
+      </w:r>
+    </w:p>
+    <w:p>
+      <w:pPr>
+        <w:pStyle w:val="Normal"/>
+      </w:pPr>
+      <w:r>
+        <w:t xml:space="preserve">John D, Tang Q, Albinali F, Intille S. An open-source monitor-independent movement summary for accelerometer data processing. </w:t>
+      </w:r>
+      <w:r>
+        <w:rPr>
+          <w:i/>
+        </w:rPr>
+        <w:t xml:space="preserve">Journal for the Measurement of Physical Behaviour</w:t>
+      </w:r>
+      <w:r>
+        <w:t xml:space="preserve">. 2019;2(4):268–281. doi:10.1123/jmpb.2018-0068.</w:t>
+      </w:r>
+    </w:p>
+    <w:p>
+      <w:pPr>
+        <w:pStyle w:val="Normal"/>
+      </w:pPr>
+      <w:r>
+        <w:t xml:space="preserve">Zhao B, Huang X, Xing Y, Luo H, Ye Z, Xu W, Shao J. Sleep irregularity and depression among U.S. adults: an accelerometer-based cross-sectional study in NHANES. </w:t>
+      </w:r>
+      <w:r>
+        <w:rPr>
+          <w:i/>
+        </w:rPr>
+        <w:t xml:space="preserve">Sleep Health</w:t>
+      </w:r>
+      <w:r>
+        <w:t xml:space="preserve">. 2026;12(4):612–618. doi:10.1016/j.sleh.2026.04.007.</w:t>
       </w:r>
     </w:p>
     <w:p>

</xml_diff>